<commit_message>
docs(features): refresh catalog with access lockdown (PR #28)
Adds:
  - Brain visibility toggle (team vs producers_only)
  - New default: brains are producers_only on creation
  - Three-tier matrix (admin/producer/artist) made explicit
  - /kit role admin command
  - /kit brain visibility subcommand
  - Note that unknown users fail-closed to artist tier

Regenerated Kit-Features.docx from the updated generator.

Co-Authored-By: Claude Opus 4.7 (1M context) <noreply@anthropic.com>
</commit_message>
<xml_diff>
--- a/Kit-Features.docx
+++ b/Kit-Features.docx
@@ -16,7 +16,7 @@
           <w:i/>
           <w:color w:val="666666"/>
         </w:rPr>
-        <w:t>Ranger &amp; Fox · 2026-06-02</w:t>
+        <w:t>Ranger &amp; Fox · 2026-06-03</w:t>
       </w:r>
     </w:p>
     <w:p>
@@ -731,7 +731,7 @@
           <w:b w:val="0"/>
           <w:sz w:val="22"/>
         </w:rPr>
-        <w:t>Open the Brain tab in any project channel to see the current state. Updates in place — there is one canvas per brain, edited as patches land. Provenance tags are stripped for readability but stored in the markdown.</w:t>
+        <w:t>Open the Brain tab in any project channel to see the current state. Updates in place — there is one canvas per brain, edited as patches land. Provenance tags are stripped for readability but stored in the markdown. NEW brains default to producers_only (no canvas) for privacy; producers flip to team-visible with /kit brain visibility team.</w:t>
       </w:r>
     </w:p>
     <w:p>
@@ -746,7 +746,54 @@
         <w:rPr>
           <w:sz w:val="22"/>
         </w:rPr>
-        <w:t>/kit brain · auto-seeded on /kit newproject completion.</w:t>
+        <w:t>/kit brain (producer/admin) · auto-seeded on /kit newproject completion (producers_only by default).</w:t>
+      </w:r>
+    </w:p>
+    <w:p>
+      <w:pPr>
+        <w:pStyle w:val="Heading3"/>
+      </w:pPr>
+      <w:r>
+        <w:t>Brain visibility toggle</w:t>
+      </w:r>
+    </w:p>
+    <w:p>
+      <w:r>
+        <w:rPr>
+          <w:b w:val="0"/>
+          <w:sz w:val="22"/>
+        </w:rPr>
+        <w:t>Per-brain privacy flag. 'producers_only' (default) means no channel canvas — the brain is accessible only via /kit brain ephemeral text to producer+ users. 'team' means a Slack Canvas tab is created and refreshed in the project channel, visible to anyone in the channel.</w:t>
+      </w:r>
+    </w:p>
+    <w:p>
+      <w:r>
+        <w:rPr>
+          <w:b/>
+          <w:sz w:val="22"/>
+        </w:rPr>
+        <w:t xml:space="preserve">How to use: </w:t>
+      </w:r>
+      <w:r>
+        <w:rPr>
+          <w:sz w:val="22"/>
+        </w:rPr>
+        <w:t>/kit brain visibility team | /kit brain visibility producers_only</w:t>
+      </w:r>
+    </w:p>
+    <w:p>
+      <w:r>
+        <w:rPr>
+          <w:b/>
+          <w:sz w:val="22"/>
+        </w:rPr>
+        <w:t xml:space="preserve">Requires: </w:t>
+      </w:r>
+      <w:r>
+        <w:rPr>
+          <w:sz w:val="22"/>
+        </w:rPr>
+        <w:t>Producer or admin tier.</w:t>
       </w:r>
     </w:p>
     <w:p>
@@ -997,7 +1044,66 @@
           <w:b w:val="0"/>
           <w:sz w:val="22"/>
         </w:rPr>
-        <w:t>admin / producer / artist. Gateway + field-level filtering. Every dispatch passes through enforceAccess before results return.</w:t>
+        <w:t>admin / producer / artist. Gateway rules block whole agent actions; field-level filtering strips sensitive fields from anything that slips through. Every specialist dispatch passes through enforceAccess. Unknown users fail-closed to artist tier (never bypass).</w:t>
+      </w:r>
+    </w:p>
+    <w:p>
+      <w:r>
+        <w:rPr>
+          <w:b/>
+          <w:sz w:val="22"/>
+        </w:rPr>
+        <w:t>Tier matrix (high level):</w:t>
+      </w:r>
+    </w:p>
+    <w:p>
+      <w:pPr>
+        <w:pStyle w:val="ListBullet"/>
+      </w:pPr>
+      <w:r>
+        <w:rPr>
+          <w:sz w:val="22"/>
+        </w:rPr>
+        <w:t>admin — sees everything (founder/owner)</w:t>
+      </w:r>
+    </w:p>
+    <w:p>
+      <w:pPr>
+        <w:pStyle w:val="ListBullet"/>
+      </w:pPr>
+      <w:r>
+        <w:rPr>
+          <w:sz w:val="22"/>
+        </w:rPr>
+        <w:t>producer — sees budgets/clients/dates/brief/contacts (per-project financial flag for raw budget queries); no margins/rates</w:t>
+      </w:r>
+    </w:p>
+    <w:p>
+      <w:pPr>
+        <w:pStyle w:val="ListBullet"/>
+      </w:pPr>
+      <w:r>
+        <w:rPr>
+          <w:sz w:val="22"/>
+        </w:rPr>
+        <w:t>artist — name + project_code + harvest_project_id + status only. No Brain, no Studio Knowledge, no client/contact/budget/date data. Can log own time, see project tasks.</w:t>
+      </w:r>
+    </w:p>
+    <w:p>
+      <w:pPr>
+        <w:pStyle w:val="Heading3"/>
+      </w:pPr>
+      <w:r>
+        <w:t>Role assignment</w:t>
+      </w:r>
+    </w:p>
+    <w:p>
+      <w:r>
+        <w:rPr>
+          <w:b w:val="0"/>
+          <w:sz w:val="22"/>
+        </w:rPr>
+        <w:t>Admins assign roles via /kit role @user producer|artist|admin|freelancer. Stored in team_members.role; takes effect immediately. Omit the role to query someone's current setting.</w:t>
       </w:r>
     </w:p>
     <w:p>
@@ -1363,7 +1469,7 @@
         <w:rPr>
           <w:sz w:val="22"/>
         </w:rPr>
-        <w:t xml:space="preserve">  — Open or refresh the current channel's Brain canvas</w:t>
+        <w:t xml:space="preserve">  — Open or refresh the current channel's Brain (producer/admin only)</w:t>
       </w:r>
     </w:p>
     <w:p>
@@ -1383,6 +1489,44 @@
           <w:sz w:val="22"/>
         </w:rPr>
         <w:t xml:space="preserve">  — Show the sources behind a fact in the Brain</w:t>
+      </w:r>
+    </w:p>
+    <w:p>
+      <w:pPr>
+        <w:pStyle w:val="ListBullet"/>
+      </w:pPr>
+      <w:r>
+        <w:rPr>
+          <w:rFonts w:ascii="Consolas" w:hAnsi="Consolas"/>
+          <w:b/>
+          <w:sz w:val="20"/>
+        </w:rPr>
+        <w:t>/kit brain visibility team|producers_only</w:t>
+      </w:r>
+      <w:r>
+        <w:rPr>
+          <w:sz w:val="22"/>
+        </w:rPr>
+        <w:t xml:space="preserve">  — Producer toggle for channel-canvas vs ephemeral-text mode</w:t>
+      </w:r>
+    </w:p>
+    <w:p>
+      <w:pPr>
+        <w:pStyle w:val="ListBullet"/>
+      </w:pPr>
+      <w:r>
+        <w:rPr>
+          <w:rFonts w:ascii="Consolas" w:hAnsi="Consolas"/>
+          <w:b/>
+          <w:sz w:val="20"/>
+        </w:rPr>
+        <w:t>/kit role @user producer|artist|admin|freelancer</w:t>
+      </w:r>
+      <w:r>
+        <w:rPr>
+          <w:sz w:val="22"/>
+        </w:rPr>
+        <w:t xml:space="preserve">  — Admin only: assign a role. Omit the role to query.</w:t>
       </w:r>
     </w:p>
     <w:p>

</xml_diff>